<commit_message>
W1-07: base data-entry section on the official Kaggle instructions
The dataset owner asks users to ignore the instructions inside the file.
Section 2 now uses the official Kaggle instructions: the label criteria
remain undocumented, highlighted values are those the source marked as
manipulated (C03), and the beta-HCG copy rule is only a possible
explanation.
</commit_message>
<xml_diff>
--- a/docs/dataset_label_specification.docx
+++ b/docs/dataset_label_specification.docx
@@ -45,21 +45,7 @@
         <w:rPr>
           <w:rFonts w:ascii="Times New Roman" w:hAnsi="Times New Roman" w:cs="Times New Roman"/>
         </w:rPr>
-        <w:t>Terminology. In May 2026 polycystic ovary syndrome (PCOS) was renamed polyendocrine metabolic ovarian syndrome (PMOS) (</w:t>
-      </w:r>
-      <w:proofErr w:type="spellStart"/>
-      <w:r>
-        <w:rPr>
-          <w:rFonts w:ascii="Times New Roman" w:hAnsi="Times New Roman" w:cs="Times New Roman"/>
-        </w:rPr>
-        <w:t>Teede</w:t>
-      </w:r>
-      <w:proofErr w:type="spellEnd"/>
-      <w:r>
-        <w:rPr>
-          <w:rFonts w:ascii="Times New Roman" w:hAnsi="Times New Roman" w:cs="Times New Roman"/>
-        </w:rPr>
-        <w:t xml:space="preserve"> et al., 2026). The renaming did not change the diagnostic criteria: the guideline reissued under the new name in June 2026 keeps the 2023 criteria unchanged. I use "PMOS" for the condition. I keep "PCOS" where I refer to the dataset's own label, "PCOS (Y/N)", because that is how the source recorded it. "PCOM" (polycystic ovarian morphology) remains the term for the ultrasound finding.</w:t>
+        <w:t xml:space="preserve">Terminology. In May 2026 polycystic ovary syndrome (PCOS) was renamed polyendocrine metabolic ovarian syndrome (PMOS) (Teede et al., 2026). The renaming did not change the diagnostic criteria: the guideline reissued under the new name in June 2026 keeps the 2023 criteria unchanged. I use "PMOS" for the condition. I keep "PCOS" where I refer to the dataset's own label, "PCOS (Y/N)", because that is how the source recorded it. "PCOM" (polycystic ovarian morphology) remains the term for the ultrasound finding.</w:t>
       </w:r>
     </w:p>
     <w:p>
@@ -244,18 +230,8 @@
                 <w:sz w:val="20"/>
                 <w:szCs w:val="20"/>
               </w:rPr>
-              <w:t xml:space="preserve">Kaggle dataset "Polycystic ovary syndrome (PCOS)" uploaded by Prasoon </w:t>
-            </w:r>
-            <w:proofErr w:type="spellStart"/>
-            <w:r>
-              <w:rPr>
-                <w:rFonts w:ascii="Times New Roman" w:hAnsi="Times New Roman" w:cs="Times New Roman"/>
-                <w:sz w:val="20"/>
-                <w:szCs w:val="20"/>
-              </w:rPr>
-              <w:t>Kottarathil</w:t>
-            </w:r>
-            <w:proofErr w:type="spellEnd"/>
+              <w:t xml:space="preserve">Kaggle dataset "Polycystic ovary syndrome (PCOS)" uploaded by Prasoon Kottarathil</w:t>
+            </w:r>
           </w:p>
         </w:tc>
       </w:tr>
@@ -326,25 +302,7 @@
                 <w:sz w:val="20"/>
                 <w:szCs w:val="20"/>
               </w:rPr>
-              <w:t xml:space="preserve">PCOS_data_without_infertility.xlsx: sheet </w:t>
-            </w:r>
-            <w:proofErr w:type="spellStart"/>
-            <w:r>
-              <w:rPr>
-                <w:rFonts w:ascii="Times New Roman" w:hAnsi="Times New Roman" w:cs="Times New Roman"/>
-                <w:sz w:val="20"/>
-                <w:szCs w:val="20"/>
-              </w:rPr>
-              <w:t>Full_new</w:t>
-            </w:r>
-            <w:proofErr w:type="spellEnd"/>
-            <w:r>
-              <w:rPr>
-                <w:rFonts w:ascii="Times New Roman" w:hAnsi="Times New Roman" w:cs="Times New Roman"/>
-                <w:sz w:val="20"/>
-                <w:szCs w:val="20"/>
-              </w:rPr>
-              <w:t xml:space="preserve"> (data) and sheet Instructions (data-entry rules)</w:t>
+              <w:t xml:space="preserve">PCOS_data_without_infertility.xlsx: sheet Full_new (data) and an Instructions sheet. The dataset owner states on Kaggle that the in-file instructions should be ignored, so the official instructions on the Kaggle page are used instead.</w:t>
             </w:r>
           </w:p>
         </w:tc>
@@ -488,23 +446,7 @@
                 <w:sz w:val="20"/>
                 <w:szCs w:val="20"/>
               </w:rPr>
-              <w:t>One record per woman: all 541 Patient File N</w:t>
-            </w:r>
-            <w:r>
-              <w:rPr>
-                <w:rFonts w:ascii="Times New Roman" w:hAnsi="Times New Roman" w:cs="Times New Roman"/>
-                <w:sz w:val="20"/>
-                <w:szCs w:val="20"/>
-              </w:rPr>
-              <w:t>umbers</w:t>
-            </w:r>
-            <w:r>
-              <w:rPr>
-                <w:rFonts w:ascii="Times New Roman" w:hAnsi="Times New Roman" w:cs="Times New Roman"/>
-                <w:sz w:val="20"/>
-                <w:szCs w:val="20"/>
-              </w:rPr>
-              <w:t xml:space="preserve"> are unique, so there are no repeat visits</w:t>
+              <w:t xml:space="preserve">One record per woman: all 541 Patient File Numbers are unique, so there are no repeat visits</w:t>
             </w:r>
           </w:p>
         </w:tc>
@@ -610,7 +552,6 @@
                 <w:rFonts w:ascii="Times New Roman" w:hAnsi="Times New Roman" w:cs="Times New Roman"/>
               </w:rPr>
             </w:pPr>
-            <w:proofErr w:type="spellStart"/>
             <w:r>
               <w:rPr>
                 <w:rFonts w:ascii="Times New Roman" w:hAnsi="Times New Roman" w:cs="Times New Roman"/>
@@ -619,7 +560,6 @@
               </w:rPr>
               <w:t>Licence</w:t>
             </w:r>
-            <w:proofErr w:type="spellEnd"/>
           </w:p>
         </w:tc>
         <w:tc>
@@ -725,35 +665,7 @@
                 <w:sz w:val="20"/>
                 <w:szCs w:val="20"/>
               </w:rPr>
-              <w:t xml:space="preserve">Kept locally in data/raw; never committed to the repository </w:t>
-            </w:r>
-            <w:proofErr w:type="gramStart"/>
-            <w:r>
-              <w:rPr>
-                <w:rFonts w:ascii="Times New Roman" w:hAnsi="Times New Roman" w:cs="Times New Roman"/>
-                <w:sz w:val="20"/>
-                <w:szCs w:val="20"/>
-              </w:rPr>
-              <w:t>(.</w:t>
-            </w:r>
-            <w:proofErr w:type="spellStart"/>
-            <w:r>
-              <w:rPr>
-                <w:rFonts w:ascii="Times New Roman" w:hAnsi="Times New Roman" w:cs="Times New Roman"/>
-                <w:sz w:val="20"/>
-                <w:szCs w:val="20"/>
-              </w:rPr>
-              <w:t>gitignore</w:t>
-            </w:r>
-            <w:proofErr w:type="spellEnd"/>
-            <w:proofErr w:type="gramEnd"/>
-            <w:r>
-              <w:rPr>
-                <w:rFonts w:ascii="Times New Roman" w:hAnsi="Times New Roman" w:cs="Times New Roman"/>
-                <w:sz w:val="20"/>
-                <w:szCs w:val="20"/>
-              </w:rPr>
-              <w:t>)</w:t>
+              <w:t xml:space="preserve">Kept locally in data/raw; never committed to the repository (.gitignore)</w:t>
             </w:r>
           </w:p>
         </w:tc>
@@ -785,17 +697,12 @@
         <w:rPr>
           <w:rFonts w:ascii="Times New Roman" w:hAnsi="Times New Roman" w:cs="Times New Roman"/>
         </w:rPr>
-        <w:t>The Instructions sheet shows that the data were transcribed by data collectors following a set of rules. Four of these rules affect how I can use the data:</w:t>
+        <w:t xml:space="preserve">The Kaggle page gives the official data-entry instructions and asks users to ignore the instructions inside the file. The official instructions cover units, Yes/No coding (1/0), blood group codes, separate systolic and diastolic blood pressure, RBS as random glucose, and two beta-HCG measurements (Case I and II). They do not say how PCOS was diagnosed or recorded, so the criteria behind the label remain undocumented.</w:t>
       </w:r>
     </w:p>
     <w:p>
       <w:pPr>
-        <w:pStyle w:val="ListParagraph"/>
-        <w:numPr>
-          <w:ilvl w:val="0"/>
-          <w:numId w:val="2"/>
-        </w:numPr>
-        <w:spacing w:after="80"/>
+        <w:spacing w:after="120"/>
         <w:rPr>
           <w:rFonts w:ascii="Times New Roman" w:hAnsi="Times New Roman" w:cs="Times New Roman"/>
         </w:rPr>
@@ -804,31 +711,12 @@
         <w:rPr>
           <w:rFonts w:ascii="Times New Roman" w:hAnsi="Times New Roman" w:cs="Times New Roman"/>
         </w:rPr>
-        <w:t xml:space="preserve">"If the patient is PCOS fill the cell with green </w:t>
-      </w:r>
-      <w:proofErr w:type="spellStart"/>
-      <w:r>
-        <w:rPr>
-          <w:rFonts w:ascii="Times New Roman" w:hAnsi="Times New Roman" w:cs="Times New Roman"/>
-        </w:rPr>
-        <w:t>colour</w:t>
-      </w:r>
-      <w:proofErr w:type="spellEnd"/>
-      <w:r>
-        <w:rPr>
-          <w:rFonts w:ascii="Times New Roman" w:hAnsi="Times New Roman" w:cs="Times New Roman"/>
-        </w:rPr>
-        <w:t>." The label was marked by the people entering the data from patient records, not derived from a stated rule. This is why I describe it as a recorded label.</w:t>
+        <w:t xml:space="preserve">One official instruction affects how I use the data: manipulated values were to be highlighted in an orangish colour. The 22 highlighted vitamin D values (patients 307–328, decision C03) are therefore values the source marked as manipulated. I keep them, as decided in C03, but report them as a known limitation and test their effect in a sensitivity analysis.</w:t>
       </w:r>
     </w:p>
     <w:p>
       <w:pPr>
-        <w:pStyle w:val="ListParagraph"/>
-        <w:numPr>
-          <w:ilvl w:val="0"/>
-          <w:numId w:val="2"/>
-        </w:numPr>
-        <w:spacing w:after="80"/>
+        <w:spacing w:after="120"/>
         <w:rPr>
           <w:rFonts w:ascii="Times New Roman" w:hAnsi="Times New Roman" w:cs="Times New Roman"/>
         </w:rPr>
@@ -837,101 +725,7 @@
         <w:rPr>
           <w:rFonts w:ascii="Times New Roman" w:hAnsi="Times New Roman" w:cs="Times New Roman"/>
         </w:rPr>
-        <w:t xml:space="preserve">"Repeat the previous one if only one exist" (beta-HCG). This explains why beta-HCG II copies beta-HCG I in most </w:t>
-      </w:r>
-      <w:proofErr w:type="gramStart"/>
-      <w:r>
-        <w:rPr>
-          <w:rFonts w:ascii="Times New Roman" w:hAnsi="Times New Roman" w:cs="Times New Roman"/>
-        </w:rPr>
-        <w:t>records, and</w:t>
-      </w:r>
-      <w:proofErr w:type="gramEnd"/>
-      <w:r>
-        <w:rPr>
-          <w:rFonts w:ascii="Times New Roman" w:hAnsi="Times New Roman" w:cs="Times New Roman"/>
-        </w:rPr>
-        <w:t xml:space="preserve"> supports excluding both columns.</w:t>
-      </w:r>
-    </w:p>
-    <w:p>
-      <w:pPr>
-        <w:pStyle w:val="ListParagraph"/>
-        <w:numPr>
-          <w:ilvl w:val="0"/>
-          <w:numId w:val="2"/>
-        </w:numPr>
-        <w:spacing w:after="80"/>
-        <w:rPr>
-          <w:rFonts w:ascii="Times New Roman" w:hAnsi="Times New Roman" w:cs="Times New Roman"/>
-        </w:rPr>
-      </w:pPr>
-      <w:r>
-        <w:rPr>
-          <w:rFonts w:ascii="Times New Roman" w:hAnsi="Times New Roman" w:cs="Times New Roman"/>
-        </w:rPr>
-        <w:t xml:space="preserve">"Ensure that no </w:t>
-      </w:r>
-      <w:proofErr w:type="spellStart"/>
-      <w:r>
-        <w:rPr>
-          <w:rFonts w:ascii="Times New Roman" w:hAnsi="Times New Roman" w:cs="Times New Roman"/>
-        </w:rPr>
-        <w:t>NaN</w:t>
-      </w:r>
-      <w:proofErr w:type="spellEnd"/>
-      <w:r>
-        <w:rPr>
-          <w:rFonts w:ascii="Times New Roman" w:hAnsi="Times New Roman" w:cs="Times New Roman"/>
-        </w:rPr>
-        <w:t xml:space="preserve"> … is made" and "fill the cell with red </w:t>
-      </w:r>
-      <w:proofErr w:type="spellStart"/>
-      <w:r>
-        <w:rPr>
-          <w:rFonts w:ascii="Times New Roman" w:hAnsi="Times New Roman" w:cs="Times New Roman"/>
-        </w:rPr>
-        <w:t>colour</w:t>
-      </w:r>
-      <w:proofErr w:type="spellEnd"/>
-      <w:r>
-        <w:rPr>
-          <w:rFonts w:ascii="Times New Roman" w:hAnsi="Times New Roman" w:cs="Times New Roman"/>
-        </w:rPr>
-        <w:t>" for blanks. Blanks may have been filled in, so zeros and repeated values can be placeholders (cleaning decisions D14–D16, C03 and C04).</w:t>
-      </w:r>
-    </w:p>
-    <w:p>
-      <w:pPr>
-        <w:pStyle w:val="ListParagraph"/>
-        <w:numPr>
-          <w:ilvl w:val="0"/>
-          <w:numId w:val="2"/>
-        </w:numPr>
-        <w:spacing w:after="80"/>
-        <w:rPr>
-          <w:rFonts w:ascii="Times New Roman" w:hAnsi="Times New Roman" w:cs="Times New Roman"/>
-        </w:rPr>
-      </w:pPr>
-      <w:r>
-        <w:rPr>
-          <w:rFonts w:ascii="Times New Roman" w:hAnsi="Times New Roman" w:cs="Times New Roman"/>
-        </w:rPr>
-        <w:t xml:space="preserve">"Manipulated </w:t>
-      </w:r>
-      <w:proofErr w:type="spellStart"/>
-      <w:r>
-        <w:rPr>
-          <w:rFonts w:ascii="Times New Roman" w:hAnsi="Times New Roman" w:cs="Times New Roman"/>
-        </w:rPr>
-        <w:t>datas</w:t>
-      </w:r>
-      <w:proofErr w:type="spellEnd"/>
-      <w:r>
-        <w:rPr>
-          <w:rFonts w:ascii="Times New Roman" w:hAnsi="Times New Roman" w:cs="Times New Roman"/>
-        </w:rPr>
-        <w:t xml:space="preserve"> … highlighted". Highlighted cells may have been edited, which is why decision C03 keeps the highlighted vitamin D values but reports them as a limitation.</w:t>
+        <w:t xml:space="preserve">The in-file Instructions sheet suggests that beta-HCG II was copied from beta-HCG I when only one test existed, which would explain why the two columns match in most records. Because the owner says to ignore those instructions, I treat this only as a possible explanation; both beta-HCG columns are excluded from modelling either way.</w:t>
       </w:r>
     </w:p>
     <w:p>
@@ -1050,21 +844,7 @@
         <w:rPr>
           <w:rFonts w:ascii="Times New Roman" w:hAnsi="Times New Roman" w:cs="Times New Roman"/>
         </w:rPr>
-        <w:t xml:space="preserve">This project follows the 2023 international guideline. The older Rotterdam 2003 criteria appear only to </w:t>
-      </w:r>
-      <w:proofErr w:type="spellStart"/>
-      <w:r>
-        <w:rPr>
-          <w:rFonts w:ascii="Times New Roman" w:hAnsi="Times New Roman" w:cs="Times New Roman"/>
-        </w:rPr>
-        <w:t>characterise</w:t>
-      </w:r>
-      <w:proofErr w:type="spellEnd"/>
-      <w:r>
-        <w:rPr>
-          <w:rFonts w:ascii="Times New Roman" w:hAnsi="Times New Roman" w:cs="Times New Roman"/>
-        </w:rPr>
-        <w:t xml:space="preserve"> the historical label in the dataset.</w:t>
+        <w:t xml:space="preserve">This project follows the 2023 international guideline. The older Rotterdam 2003 criteria appear only to characterise the historical label in the dataset.</w:t>
       </w:r>
     </w:p>
     <w:p>
@@ -1652,21 +1432,7 @@
         <w:rPr>
           <w:rFonts w:ascii="Times New Roman" w:hAnsi="Times New Roman" w:cs="Times New Roman"/>
         </w:rPr>
-        <w:t xml:space="preserve">Why </w:t>
-      </w:r>
-      <w:proofErr w:type="gramStart"/>
-      <w:r>
-        <w:rPr>
-          <w:rFonts w:ascii="Times New Roman" w:hAnsi="Times New Roman" w:cs="Times New Roman"/>
-        </w:rPr>
-        <w:t>the</w:t>
-      </w:r>
-      <w:proofErr w:type="gramEnd"/>
-      <w:r>
-        <w:rPr>
-          <w:rFonts w:ascii="Times New Roman" w:hAnsi="Times New Roman" w:cs="Times New Roman"/>
-        </w:rPr>
-        <w:t xml:space="preserve"> 2003 criteria appear at all. The dataset was in public use before the 2023 guideline existed: studies in my Literature Survey Matrix used it from 2022 onwards. Whoever assigned the labels could therefore only have used the criteria in force at the time. The label cannot be changed, but it can be compared with both versions to see which it resembles (section 5). That comparison is a finding about the data, not a choice of guideline.</w:t>
+        <w:t xml:space="preserve">Why the 2003 criteria appear at all. The dataset was in public use before the 2023 guideline existed: studies in my Literature Survey Matrix used it from 2022 onwards. Whoever assigned the labels could therefore only have used the criteria in force at the time. The label cannot be changed, but it can be compared with both versions to see which it resembles (section 5). That comparison is a finding about the data, not a choice of guideline.</w:t>
       </w:r>
     </w:p>
     <w:p>
@@ -1917,25 +1683,7 @@
                 <w:sz w:val="20"/>
                 <w:szCs w:val="20"/>
               </w:rPr>
-              <w:t xml:space="preserve">It is historical data; </w:t>
-            </w:r>
-            <w:proofErr w:type="spellStart"/>
-            <w:r>
-              <w:rPr>
-                <w:rFonts w:ascii="Times New Roman" w:hAnsi="Times New Roman" w:cs="Times New Roman"/>
-                <w:sz w:val="20"/>
-                <w:szCs w:val="20"/>
-              </w:rPr>
-              <w:t>relabelling</w:t>
-            </w:r>
-            <w:proofErr w:type="spellEnd"/>
-            <w:r>
-              <w:rPr>
-                <w:rFonts w:ascii="Times New Roman" w:hAnsi="Times New Roman" w:cs="Times New Roman"/>
-                <w:sz w:val="20"/>
-                <w:szCs w:val="20"/>
-              </w:rPr>
-              <w:t xml:space="preserve"> it would create a new, undocumented outcome</w:t>
+              <w:t xml:space="preserve">It is historical data; relabelling it would create a new, undocumented outcome</w:t>
             </w:r>
           </w:p>
         </w:tc>
@@ -2768,25 +2516,7 @@
                 <w:sz w:val="20"/>
                 <w:szCs w:val="20"/>
               </w:rPr>
-              <w:t xml:space="preserve">Median beta-HCG 289 </w:t>
-            </w:r>
-            <w:proofErr w:type="spellStart"/>
-            <w:r>
-              <w:rPr>
-                <w:rFonts w:ascii="Times New Roman" w:hAnsi="Times New Roman" w:cs="Times New Roman"/>
-                <w:sz w:val="20"/>
-                <w:szCs w:val="20"/>
-              </w:rPr>
-              <w:t>mIU</w:t>
-            </w:r>
-            <w:proofErr w:type="spellEnd"/>
-            <w:r>
-              <w:rPr>
-                <w:rFonts w:ascii="Times New Roman" w:hAnsi="Times New Roman" w:cs="Times New Roman"/>
-                <w:sz w:val="20"/>
-                <w:szCs w:val="20"/>
-              </w:rPr>
-              <w:t>/mL, against 1.99 in the rest</w:t>
+              <w:t xml:space="preserve">Median beta-HCG 289 mIU/mL, against 1.99 in the rest</w:t>
             </w:r>
           </w:p>
         </w:tc>
@@ -2826,25 +2556,7 @@
                 <w:sz w:val="20"/>
                 <w:szCs w:val="20"/>
               </w:rPr>
-              <w:t xml:space="preserve">Not marked pregnant but beta-HCG 25 </w:t>
-            </w:r>
-            <w:proofErr w:type="spellStart"/>
-            <w:r>
-              <w:rPr>
-                <w:rFonts w:ascii="Times New Roman" w:hAnsi="Times New Roman" w:cs="Times New Roman"/>
-                <w:sz w:val="20"/>
-                <w:szCs w:val="20"/>
-              </w:rPr>
-              <w:t>mIU</w:t>
-            </w:r>
-            <w:proofErr w:type="spellEnd"/>
-            <w:r>
-              <w:rPr>
-                <w:rFonts w:ascii="Times New Roman" w:hAnsi="Times New Roman" w:cs="Times New Roman"/>
-                <w:sz w:val="20"/>
-                <w:szCs w:val="20"/>
-              </w:rPr>
-              <w:t>/mL or above</w:t>
+              <w:t xml:space="preserve">Not marked pregnant but beta-HCG 25 mIU/mL or above</w:t>
             </w:r>
           </w:p>
         </w:tc>
@@ -2954,27 +2666,7 @@
         <w:rPr>
           <w:rFonts w:ascii="Times New Roman" w:hAnsi="Times New Roman" w:cs="Times New Roman"/>
         </w:rPr>
-        <w:t xml:space="preserve">Population: origin </w:t>
-      </w:r>
-      <w:proofErr w:type="gramStart"/>
-      <w:r>
-        <w:rPr>
-          <w:rFonts w:ascii="Times New Roman" w:hAnsi="Times New Roman" w:cs="Times New Roman"/>
-        </w:rPr>
-        <w:t>unverified .</w:t>
-      </w:r>
-      <w:proofErr w:type="gramEnd"/>
-      <w:r>
-        <w:rPr>
-          <w:rFonts w:ascii="Times New Roman" w:hAnsi="Times New Roman" w:cs="Times New Roman"/>
-        </w:rPr>
-        <w:t xml:space="preserve"> If the data are from Indian women, note that the 20-follicle threshold is contested in this population</w:t>
-      </w:r>
-      <w:r>
-        <w:rPr>
-          <w:rFonts w:ascii="Times New Roman" w:hAnsi="Times New Roman" w:cs="Times New Roman"/>
-        </w:rPr>
-        <w:t>.</w:t>
+        <w:t xml:space="preserve">Population: origin unverified . If the data are from Indian women, note that the 20-follicle threshold is contested in this population.</w:t>
       </w:r>
     </w:p>
     <w:p>
@@ -2993,19 +2685,7 @@
         <w:rPr>
           <w:rFonts w:ascii="Times New Roman" w:hAnsi="Times New Roman" w:cs="Times New Roman"/>
         </w:rPr>
-        <w:t xml:space="preserve">Pregnancy: 206 records (38%) appear to be from currently pregnant women, when PMOS cannot be assessed reliably. My main analysis keeps all records so that results stay comparable with published work on this dataset. A sensitivity analysis excludes them, leaving 335 records (113 PCOS, 222 non-PCOS) </w:t>
-      </w:r>
-      <w:r>
-        <w:rPr>
-          <w:rFonts w:ascii="Times New Roman" w:hAnsi="Times New Roman" w:cs="Times New Roman"/>
-        </w:rPr>
-        <w:t>-</w:t>
-      </w:r>
-      <w:r>
-        <w:rPr>
-          <w:rFonts w:ascii="Times New Roman" w:hAnsi="Times New Roman" w:cs="Times New Roman"/>
-        </w:rPr>
-        <w:t xml:space="preserve"> needs supervisor approval.</w:t>
+        <w:t xml:space="preserve">Pregnancy: 206 records (38%) appear to be from currently pregnant women, when PMOS cannot be assessed reliably. My main analysis keeps all records so that results stay comparable with published work on this dataset. A sensitivity analysis excludes them, leaving 335 records (113 PCOS, 222 non-PCOS) - needs supervisor approval.</w:t>
       </w:r>
     </w:p>
     <w:p>
@@ -3053,21 +2733,7 @@
         <w:rPr>
           <w:rFonts w:ascii="Times New Roman" w:hAnsi="Times New Roman" w:cs="Times New Roman"/>
         </w:rPr>
-        <w:t xml:space="preserve">Several inputs are the same information the source clinicians probably used to assign the label. The </w:t>
-      </w:r>
-      <w:proofErr w:type="spellStart"/>
-      <w:r>
-        <w:rPr>
-          <w:rFonts w:ascii="Times New Roman" w:hAnsi="Times New Roman" w:cs="Times New Roman"/>
-        </w:rPr>
-        <w:t>rotterdam_criterion</w:t>
-      </w:r>
-      <w:proofErr w:type="spellEnd"/>
-      <w:r>
-        <w:rPr>
-          <w:rFonts w:ascii="Times New Roman" w:hAnsi="Times New Roman" w:cs="Times New Roman"/>
-        </w:rPr>
-        <w:t xml:space="preserve"> column in docs/feature_groups.xlsx records this:</w:t>
+        <w:t xml:space="preserve">Several inputs are the same information the source clinicians probably used to assign the label. The rotterdam_criterion column in docs/feature_groups.xlsx records this:</w:t>
       </w:r>
     </w:p>
     <w:tbl>
@@ -3237,25 +2903,7 @@
                 <w:sz w:val="20"/>
                 <w:szCs w:val="20"/>
               </w:rPr>
-              <w:t xml:space="preserve">Cycle(R/I), Cycle length(days); </w:t>
-            </w:r>
-            <w:proofErr w:type="gramStart"/>
-            <w:r>
-              <w:rPr>
-                <w:rFonts w:ascii="Times New Roman" w:hAnsi="Times New Roman" w:cs="Times New Roman"/>
-                <w:sz w:val="20"/>
-                <w:szCs w:val="20"/>
-              </w:rPr>
-              <w:t>PRG(</w:t>
-            </w:r>
-            <w:proofErr w:type="gramEnd"/>
-            <w:r>
-              <w:rPr>
-                <w:rFonts w:ascii="Times New Roman" w:hAnsi="Times New Roman" w:cs="Times New Roman"/>
-                <w:sz w:val="20"/>
-                <w:szCs w:val="20"/>
-              </w:rPr>
-              <w:t>ng/mL) as supporting evidence</w:t>
+              <w:t xml:space="preserve">Cycle(R/I), Cycle length(days); PRG(ng/mL) as supporting evidence</w:t>
             </w:r>
           </w:p>
         </w:tc>
@@ -3399,25 +3047,7 @@
                 <w:sz w:val="20"/>
                 <w:szCs w:val="20"/>
               </w:rPr>
-              <w:t xml:space="preserve">Follicle No. (L), Follicle No. (R), </w:t>
-            </w:r>
-            <w:proofErr w:type="gramStart"/>
-            <w:r>
-              <w:rPr>
-                <w:rFonts w:ascii="Times New Roman" w:hAnsi="Times New Roman" w:cs="Times New Roman"/>
-                <w:sz w:val="20"/>
-                <w:szCs w:val="20"/>
-              </w:rPr>
-              <w:t>AMH(</w:t>
-            </w:r>
-            <w:proofErr w:type="gramEnd"/>
-            <w:r>
-              <w:rPr>
-                <w:rFonts w:ascii="Times New Roman" w:hAnsi="Times New Roman" w:cs="Times New Roman"/>
-                <w:sz w:val="20"/>
-                <w:szCs w:val="20"/>
-              </w:rPr>
-              <w:t>ng/mL)</w:t>
+              <w:t xml:space="preserve">Follicle No. (L), Follicle No. (R), AMH(ng/mL)</w:t>
             </w:r>
           </w:p>
         </w:tc>
@@ -3489,43 +3119,7 @@
                 <w:sz w:val="20"/>
                 <w:szCs w:val="20"/>
               </w:rPr>
-              <w:t>TSH (</w:t>
-            </w:r>
-            <w:proofErr w:type="spellStart"/>
-            <w:r>
-              <w:rPr>
-                <w:rFonts w:ascii="Times New Roman" w:hAnsi="Times New Roman" w:cs="Times New Roman"/>
-                <w:sz w:val="20"/>
-                <w:szCs w:val="20"/>
-              </w:rPr>
-              <w:t>mIU</w:t>
-            </w:r>
-            <w:proofErr w:type="spellEnd"/>
-            <w:r>
-              <w:rPr>
-                <w:rFonts w:ascii="Times New Roman" w:hAnsi="Times New Roman" w:cs="Times New Roman"/>
-                <w:sz w:val="20"/>
-                <w:szCs w:val="20"/>
-              </w:rPr>
-              <w:t xml:space="preserve">/L), </w:t>
-            </w:r>
-            <w:proofErr w:type="gramStart"/>
-            <w:r>
-              <w:rPr>
-                <w:rFonts w:ascii="Times New Roman" w:hAnsi="Times New Roman" w:cs="Times New Roman"/>
-                <w:sz w:val="20"/>
-                <w:szCs w:val="20"/>
-              </w:rPr>
-              <w:t>PRL(</w:t>
-            </w:r>
-            <w:proofErr w:type="gramEnd"/>
-            <w:r>
-              <w:rPr>
-                <w:rFonts w:ascii="Times New Roman" w:hAnsi="Times New Roman" w:cs="Times New Roman"/>
-                <w:sz w:val="20"/>
-                <w:szCs w:val="20"/>
-              </w:rPr>
-              <w:t>ng/mL), Pregnant(Y/N), beta-HCG I and II</w:t>
+              <w:t xml:space="preserve">TSH (mIU/L), PRL(ng/mL), Pregnant(Y/N), beta-HCG I and II</w:t>
             </w:r>
           </w:p>
         </w:tc>
@@ -4023,25 +3617,7 @@
                 <w:sz w:val="20"/>
                 <w:szCs w:val="20"/>
               </w:rPr>
-              <w:t>"</w:t>
-            </w:r>
-            <w:proofErr w:type="spellStart"/>
-            <w:r>
-              <w:rPr>
-                <w:rFonts w:ascii="Times New Roman" w:hAnsi="Times New Roman" w:cs="Times New Roman"/>
-                <w:sz w:val="20"/>
-                <w:szCs w:val="20"/>
-              </w:rPr>
-              <w:t>Generalises</w:t>
-            </w:r>
-            <w:proofErr w:type="spellEnd"/>
-            <w:r>
-              <w:rPr>
-                <w:rFonts w:ascii="Times New Roman" w:hAnsi="Times New Roman" w:cs="Times New Roman"/>
-                <w:sz w:val="20"/>
-                <w:szCs w:val="20"/>
-              </w:rPr>
-              <w:t xml:space="preserve"> to all women" or "applies to adolescents"</w:t>
+              <w:t xml:space="preserve">"Generalises to all women" or "applies to adolescents"</w:t>
             </w:r>
           </w:p>
         </w:tc>

</xml_diff>